<commit_message>
Fix section numbering in DOCX documents
Remove --number-sections flag from pandoc conversion to prevent
double numbering. The markdown source already has proper section
numbering (1., 2., 3., etc.), so pandoc's automatic numbering
was creating duplicated and incorrect section labels.

**Fixed Files:**
- 2_LLRF_UPGRADE_SYSTEM_DESIGN.docx - Clean conversion with proper numbering
- SPEAR3_LLRF_Upgrade_System_Design_Final.docx - Professional version with correct TOC

Both documents now maintain the original section numbering structure
from the markdown source with proper table of contents navigation.

Co-authored-by: fayaw <faya.wang@gmail.com>
</commit_message>
<xml_diff>
--- a/Designs/SPEAR3_LLRF_Upgrade_System_Design_Final.docx
+++ b/Designs/SPEAR3_LLRF_Upgrade_System_Design_Final.docx
@@ -452,15 +452,6 @@
         <w:pStyle w:val="Heading1"/>
       </w:pPr>
       <w:r>
-        <w:rPr>
-          <w:rStyle w:val="SectionNumber"/>
-        </w:rPr>
-        <w:t xml:space="preserve">1</w:t>
-      </w:r>
-      <w:r>
-        <w:tab/>
-      </w:r>
-      <w:r>
         <w:t xml:space="preserve">SPEAR3 LLRF Upgrade System Design</w:t>
       </w:r>
     </w:p>
@@ -579,15 +570,6 @@
       <w:pPr>
         <w:pStyle w:val="Heading2"/>
       </w:pPr>
-      <w:r>
-        <w:rPr>
-          <w:rStyle w:val="SectionNumber"/>
-        </w:rPr>
-        <w:t xml:space="preserve">1.1</w:t>
-      </w:r>
-      <w:r>
-        <w:tab/>
-      </w:r>
       <w:r>
         <w:t xml:space="preserve">Table of Contents</w:t>
       </w:r>
@@ -895,15 +877,6 @@
         <w:pStyle w:val="Heading2"/>
       </w:pPr>
       <w:r>
-        <w:rPr>
-          <w:rStyle w:val="SectionNumber"/>
-        </w:rPr>
-        <w:t xml:space="preserve">1.2</w:t>
-      </w:r>
-      <w:r>
-        <w:tab/>
-      </w:r>
-      <w:r>
         <w:t xml:space="preserve">1. System Overview</w:t>
       </w:r>
     </w:p>
@@ -912,15 +885,6 @@
       <w:pPr>
         <w:pStyle w:val="Heading3"/>
       </w:pPr>
-      <w:r>
-        <w:rPr>
-          <w:rStyle w:val="SectionNumber"/>
-        </w:rPr>
-        <w:t xml:space="preserve">1.2.1</w:t>
-      </w:r>
-      <w:r>
-        <w:tab/>
-      </w:r>
       <w:r>
         <w:t xml:space="preserve">1.1 Scope</w:t>
       </w:r>
@@ -939,15 +903,6 @@
       <w:pPr>
         <w:pStyle w:val="Heading3"/>
       </w:pPr>
-      <w:r>
-        <w:rPr>
-          <w:rStyle w:val="SectionNumber"/>
-        </w:rPr>
-        <w:t xml:space="preserve">1.2.2</w:t>
-      </w:r>
-      <w:r>
-        <w:tab/>
-      </w:r>
       <w:r>
         <w:t xml:space="preserve">1.2 Key System Parameters</w:t>
       </w:r>
@@ -1278,15 +1233,6 @@
         <w:pStyle w:val="Heading3"/>
       </w:pPr>
       <w:r>
-        <w:rPr>
-          <w:rStyle w:val="SectionNumber"/>
-        </w:rPr>
-        <w:t xml:space="preserve">1.2.3</w:t>
-      </w:r>
-      <w:r>
-        <w:tab/>
-      </w:r>
-      <w:r>
         <w:t xml:space="preserve">1.3 Subsystem Summary</w:t>
       </w:r>
     </w:p>
@@ -1662,15 +1608,6 @@
         <w:pStyle w:val="Heading2"/>
       </w:pPr>
       <w:r>
-        <w:rPr>
-          <w:rStyle w:val="SectionNumber"/>
-        </w:rPr>
-        <w:t xml:space="preserve">1.3</w:t>
-      </w:r>
-      <w:r>
-        <w:tab/>
-      </w:r>
-      <w:r>
         <w:t xml:space="preserve">2. System Architecture</w:t>
       </w:r>
     </w:p>
@@ -1679,15 +1616,6 @@
       <w:pPr>
         <w:pStyle w:val="Heading3"/>
       </w:pPr>
-      <w:r>
-        <w:rPr>
-          <w:rStyle w:val="SectionNumber"/>
-        </w:rPr>
-        <w:t xml:space="preserve">1.3.1</w:t>
-      </w:r>
-      <w:r>
-        <w:tab/>
-      </w:r>
       <w:r>
         <w:t xml:space="preserve">2.1 Fundamental Design Principle</w:t>
       </w:r>
@@ -1835,15 +1763,6 @@
         <w:pStyle w:val="Heading3"/>
       </w:pPr>
       <w:r>
-        <w:rPr>
-          <w:rStyle w:val="SectionNumber"/>
-        </w:rPr>
-        <w:t xml:space="preserve">1.3.2</w:t>
-      </w:r>
-      <w:r>
-        <w:tab/>
-      </w:r>
-      <w:r>
         <w:t xml:space="preserve">2.2 Two-Layer Architecture</w:t>
       </w:r>
     </w:p>
@@ -1952,15 +1871,6 @@
         <w:pStyle w:val="Heading3"/>
       </w:pPr>
       <w:r>
-        <w:rPr>
-          <w:rStyle w:val="SectionNumber"/>
-        </w:rPr>
-        <w:t xml:space="preserve">1.3.3</w:t>
-      </w:r>
-      <w:r>
-        <w:tab/>
-      </w:r>
-      <w:r>
         <w:t xml:space="preserve">2.3 System Block Diagram</w:t>
       </w:r>
     </w:p>
@@ -2215,15 +2125,6 @@
       <w:pPr>
         <w:pStyle w:val="Heading3"/>
       </w:pPr>
-      <w:r>
-        <w:rPr>
-          <w:rStyle w:val="SectionNumber"/>
-        </w:rPr>
-        <w:t xml:space="preserve">1.3.4</w:t>
-      </w:r>
-      <w:r>
-        <w:tab/>
-      </w:r>
       <w:r>
         <w:t xml:space="preserve">2.4 Hardware/Software Responsibility Matrix</w:t>
       </w:r>
@@ -3609,15 +3510,6 @@
         <w:pStyle w:val="Heading2"/>
       </w:pPr>
       <w:r>
-        <w:rPr>
-          <w:rStyle w:val="SectionNumber"/>
-        </w:rPr>
-        <w:t xml:space="preserve">1.4</w:t>
-      </w:r>
-      <w:r>
-        <w:tab/>
-      </w:r>
-      <w:r>
         <w:t xml:space="preserve">3. LLRF9 Controller Configuration</w:t>
       </w:r>
     </w:p>
@@ -3626,15 +3518,6 @@
       <w:pPr>
         <w:pStyle w:val="Heading3"/>
       </w:pPr>
-      <w:r>
-        <w:rPr>
-          <w:rStyle w:val="SectionNumber"/>
-        </w:rPr>
-        <w:t xml:space="preserve">1.4.1</w:t>
-      </w:r>
-      <w:r>
-        <w:tab/>
-      </w:r>
       <w:r>
         <w:t xml:space="preserve">3.1 Hardware Overview</w:t>
       </w:r>
@@ -3749,15 +3632,6 @@
         <w:pStyle w:val="Heading3"/>
       </w:pPr>
       <w:r>
-        <w:rPr>
-          <w:rStyle w:val="SectionNumber"/>
-        </w:rPr>
-        <w:t xml:space="preserve">1.4.2</w:t>
-      </w:r>
-      <w:r>
-        <w:tab/>
-      </w:r>
-      <w:r>
         <w:t xml:space="preserve">3.2 RF Channel Architecture</w:t>
       </w:r>
     </w:p>
@@ -3788,15 +3662,6 @@
       <w:pPr>
         <w:pStyle w:val="Heading3"/>
       </w:pPr>
-      <w:r>
-        <w:rPr>
-          <w:rStyle w:val="SectionNumber"/>
-        </w:rPr>
-        <w:t xml:space="preserve">1.4.3</w:t>
-      </w:r>
-      <w:r>
-        <w:tab/>
-      </w:r>
       <w:r>
         <w:t xml:space="preserve">3.3 LO Signal Generation (LLRF9/476)</w:t>
       </w:r>
@@ -4051,15 +3916,6 @@
         <w:pStyle w:val="Heading3"/>
       </w:pPr>
       <w:r>
-        <w:rPr>
-          <w:rStyle w:val="SectionNumber"/>
-        </w:rPr>
-        <w:t xml:space="preserve">1.4.4</w:t>
-      </w:r>
-      <w:r>
-        <w:tab/>
-      </w:r>
-      <w:r>
         <w:t xml:space="preserve">3.4 Two-Unit Configuration</w:t>
       </w:r>
     </w:p>
@@ -4208,15 +4064,6 @@
       <w:pPr>
         <w:pStyle w:val="Heading3"/>
       </w:pPr>
-      <w:r>
-        <w:rPr>
-          <w:rStyle w:val="SectionNumber"/>
-        </w:rPr>
-        <w:t xml:space="preserve">1.4.5</w:t>
-      </w:r>
-      <w:r>
-        <w:tab/>
-      </w:r>
       <w:r>
         <w:t xml:space="preserve">3.5 Channel Assignment</w:t>
       </w:r>
@@ -5402,15 +5249,6 @@
         <w:pStyle w:val="Heading3"/>
       </w:pPr>
       <w:r>
-        <w:rPr>
-          <w:rStyle w:val="SectionNumber"/>
-        </w:rPr>
-        <w:t xml:space="preserve">1.4.6</w:t>
-      </w:r>
-      <w:r>
-        <w:tab/>
-      </w:r>
-      <w:r>
         <w:t xml:space="preserve">3.6 Key Capabilities Utilized</w:t>
       </w:r>
     </w:p>
@@ -5968,15 +5806,6 @@
         <w:pStyle w:val="Heading3"/>
       </w:pPr>
       <w:r>
-        <w:rPr>
-          <w:rStyle w:val="SectionNumber"/>
-        </w:rPr>
-        <w:t xml:space="preserve">1.4.7</w:t>
-      </w:r>
-      <w:r>
-        <w:tab/>
-      </w:r>
-      <w:r>
         <w:t xml:space="preserve">3.7 What LLRF9 Eliminates from Legacy</w:t>
       </w:r>
     </w:p>
@@ -6057,15 +5886,6 @@
         <w:pStyle w:val="Heading2"/>
       </w:pPr>
       <w:r>
-        <w:rPr>
-          <w:rStyle w:val="SectionNumber"/>
-        </w:rPr>
-        <w:t xml:space="preserve">1.5</w:t>
-      </w:r>
-      <w:r>
-        <w:tab/>
-      </w:r>
-      <w:r>
         <w:t xml:space="preserve">4. Interface Chassis</w:t>
       </w:r>
     </w:p>
@@ -6074,15 +5894,6 @@
       <w:pPr>
         <w:pStyle w:val="Heading3"/>
       </w:pPr>
-      <w:r>
-        <w:rPr>
-          <w:rStyle w:val="SectionNumber"/>
-        </w:rPr>
-        <w:t xml:space="preserve">1.5.1</w:t>
-      </w:r>
-      <w:r>
-        <w:tab/>
-      </w:r>
       <w:r>
         <w:t xml:space="preserve">4.1 Purpose</w:t>
       </w:r>
@@ -6117,15 +5928,6 @@
       <w:pPr>
         <w:pStyle w:val="Heading3"/>
       </w:pPr>
-      <w:r>
-        <w:rPr>
-          <w:rStyle w:val="SectionNumber"/>
-        </w:rPr>
-        <w:t xml:space="preserve">1.5.2</w:t>
-      </w:r>
-      <w:r>
-        <w:tab/>
-      </w:r>
       <w:r>
         <w:t xml:space="preserve">4.2 Design Requirements</w:t>
       </w:r>
@@ -6268,15 +6070,6 @@
       <w:pPr>
         <w:pStyle w:val="Heading3"/>
       </w:pPr>
-      <w:r>
-        <w:rPr>
-          <w:rStyle w:val="SectionNumber"/>
-        </w:rPr>
-        <w:t xml:space="preserve">1.5.3</w:t>
-      </w:r>
-      <w:r>
-        <w:tab/>
-      </w:r>
       <w:r>
         <w:t xml:space="preserve">4.3 Signal Interface Specification</w:t>
       </w:r>
@@ -7333,15 +7126,6 @@
         <w:pStyle w:val="Heading3"/>
       </w:pPr>
       <w:r>
-        <w:rPr>
-          <w:rStyle w:val="SectionNumber"/>
-        </w:rPr>
-        <w:t xml:space="preserve">1.5.4</w:t>
-      </w:r>
-      <w:r>
-        <w:tab/>
-      </w:r>
-      <w:r>
         <w:t xml:space="preserve">4.4 Isolation Components</w:t>
       </w:r>
     </w:p>
@@ -7390,15 +7174,6 @@
         <w:pStyle w:val="Heading3"/>
       </w:pPr>
       <w:r>
-        <w:rPr>
-          <w:rStyle w:val="SectionNumber"/>
-        </w:rPr>
-        <w:t xml:space="preserve">1.5.5</w:t>
-      </w:r>
-      <w:r>
-        <w:tab/>
-      </w:r>
-      <w:r>
         <w:t xml:space="preserve">4.5 Interlock Signal Flow</w:t>
       </w:r>
     </w:p>
@@ -7594,15 +7369,6 @@
       <w:pPr>
         <w:pStyle w:val="Heading3"/>
       </w:pPr>
-      <w:r>
-        <w:rPr>
-          <w:rStyle w:val="SectionNumber"/>
-        </w:rPr>
-        <w:t xml:space="preserve">1.5.6</w:t>
-      </w:r>
-      <w:r>
-        <w:tab/>
-      </w:r>
       <w:r>
         <w:t xml:space="preserve">4.6 Critical Design Consideration: LLRF9 Enable/Status Loop</w:t>
       </w:r>
@@ -7730,15 +7496,6 @@
         <w:pStyle w:val="Heading2"/>
       </w:pPr>
       <w:r>
-        <w:rPr>
-          <w:rStyle w:val="SectionNumber"/>
-        </w:rPr>
-        <w:t xml:space="preserve">1.6</w:t>
-      </w:r>
-      <w:r>
-        <w:tab/>
-      </w:r>
-      <w:r>
         <w:t xml:space="preserve">5. Waveform Buffer System</w:t>
       </w:r>
     </w:p>
@@ -7747,15 +7504,6 @@
       <w:pPr>
         <w:pStyle w:val="Heading3"/>
       </w:pPr>
-      <w:r>
-        <w:rPr>
-          <w:rStyle w:val="SectionNumber"/>
-        </w:rPr>
-        <w:t xml:space="preserve">1.6.1</w:t>
-      </w:r>
-      <w:r>
-        <w:tab/>
-      </w:r>
       <w:r>
         <w:t xml:space="preserve">5.1 Purpose</w:t>
       </w:r>
@@ -7790,15 +7538,6 @@
       <w:pPr>
         <w:pStyle w:val="Heading3"/>
       </w:pPr>
-      <w:r>
-        <w:rPr>
-          <w:rStyle w:val="SectionNumber"/>
-        </w:rPr>
-        <w:t xml:space="preserve">1.6.2</w:t>
-      </w:r>
-      <w:r>
-        <w:tab/>
-      </w:r>
       <w:r>
         <w:t xml:space="preserve">5.2 RF Signal Monitoring (8 channels)</w:t>
       </w:r>
@@ -8215,15 +7954,6 @@
         <w:pStyle w:val="Heading3"/>
       </w:pPr>
       <w:r>
-        <w:rPr>
-          <w:rStyle w:val="SectionNumber"/>
-        </w:rPr>
-        <w:t xml:space="preserve">1.6.3</w:t>
-      </w:r>
-      <w:r>
-        <w:tab/>
-      </w:r>
-      <w:r>
         <w:t xml:space="preserve">5.3 HVPS Signal Monitoring (4 channels)</w:t>
       </w:r>
     </w:p>
@@ -8469,15 +8199,6 @@
         <w:pStyle w:val="Heading3"/>
       </w:pPr>
       <w:r>
-        <w:rPr>
-          <w:rStyle w:val="SectionNumber"/>
-        </w:rPr>
-        <w:t xml:space="preserve">1.6.4</w:t>
-      </w:r>
-      <w:r>
-        <w:tab/>
-      </w:r>
-      <w:r>
         <w:t xml:space="preserve">5.4 Klystron Collector Power Protection</w:t>
       </w:r>
     </w:p>
@@ -8583,15 +8304,6 @@
       <w:pPr>
         <w:pStyle w:val="Heading3"/>
       </w:pPr>
-      <w:r>
-        <w:rPr>
-          <w:rStyle w:val="SectionNumber"/>
-        </w:rPr>
-        <w:t xml:space="preserve">1.6.5</w:t>
-      </w:r>
-      <w:r>
-        <w:tab/>
-      </w:r>
       <w:r>
         <w:t xml:space="preserve">5.5 Normal Operation</w:t>
       </w:r>
@@ -8637,15 +8349,6 @@
         <w:pStyle w:val="Heading2"/>
       </w:pPr>
       <w:r>
-        <w:rPr>
-          <w:rStyle w:val="SectionNumber"/>
-        </w:rPr>
-        <w:t xml:space="preserve">1.7</w:t>
-      </w:r>
-      <w:r>
-        <w:tab/>
-      </w:r>
-      <w:r>
         <w:t xml:space="preserve">6. HVPS Control System</w:t>
       </w:r>
     </w:p>
@@ -8654,15 +8357,6 @@
       <w:pPr>
         <w:pStyle w:val="Heading3"/>
       </w:pPr>
-      <w:r>
-        <w:rPr>
-          <w:rStyle w:val="SectionNumber"/>
-        </w:rPr>
-        <w:t xml:space="preserve">1.7.1</w:t>
-      </w:r>
-      <w:r>
-        <w:tab/>
-      </w:r>
       <w:r>
         <w:t xml:space="preserve">6.1 System Architecture Overview</w:t>
       </w:r>
@@ -8753,15 +8447,6 @@
       <w:pPr>
         <w:pStyle w:val="Heading3"/>
       </w:pPr>
-      <w:r>
-        <w:rPr>
-          <w:rStyle w:val="SectionNumber"/>
-        </w:rPr>
-        <w:t xml:space="preserve">1.7.2</w:t>
-      </w:r>
-      <w:r>
-        <w:tab/>
-      </w:r>
       <w:r>
         <w:t xml:space="preserve">6.2 Hardware/Software Responsibility Matrix</w:t>
       </w:r>
@@ -9644,15 +9329,6 @@
         <w:pStyle w:val="Heading3"/>
       </w:pPr>
       <w:r>
-        <w:rPr>
-          <w:rStyle w:val="SectionNumber"/>
-        </w:rPr>
-        <w:t xml:space="preserve">1.7.3</w:t>
-      </w:r>
-      <w:r>
-        <w:tab/>
-      </w:r>
-      <w:r>
         <w:t xml:space="preserve">6.3 Power Section (Retained Hardware)</w:t>
       </w:r>
     </w:p>
@@ -9885,15 +9561,6 @@
         <w:pStyle w:val="Heading3"/>
       </w:pPr>
       <w:r>
-        <w:rPr>
-          <w:rStyle w:val="SectionNumber"/>
-        </w:rPr>
-        <w:t xml:space="preserve">1.7.4</w:t>
-      </w:r>
-      <w:r>
-        <w:tab/>
-      </w:r>
-      <w:r>
         <w:t xml:space="preserve">6.4 CompactLogix PLC Specifications</w:t>
       </w:r>
     </w:p>
@@ -10099,15 +9766,6 @@
         <w:pStyle w:val="Heading3"/>
       </w:pPr>
       <w:r>
-        <w:rPr>
-          <w:rStyle w:val="SectionNumber"/>
-        </w:rPr>
-        <w:t xml:space="preserve">1.7.5</w:t>
-      </w:r>
-      <w:r>
-        <w:tab/>
-      </w:r>
-      <w:r>
         <w:t xml:space="preserve">6.5 Enerpro Gate Driver Upgrade</w:t>
       </w:r>
     </w:p>
@@ -10323,15 +9981,6 @@
       <w:pPr>
         <w:pStyle w:val="Heading3"/>
       </w:pPr>
-      <w:r>
-        <w:rPr>
-          <w:rStyle w:val="SectionNumber"/>
-        </w:rPr>
-        <w:t xml:space="preserve">1.7.6</w:t>
-      </w:r>
-      <w:r>
-        <w:tab/>
-      </w:r>
       <w:r>
         <w:t xml:space="preserve">6.6 Regulator Board Redesign</w:t>
       </w:r>
@@ -10667,15 +10316,6 @@
         <w:pStyle w:val="Heading3"/>
       </w:pPr>
       <w:r>
-        <w:rPr>
-          <w:rStyle w:val="SectionNumber"/>
-        </w:rPr>
-        <w:t xml:space="preserve">1.7.7</w:t>
-      </w:r>
-      <w:r>
-        <w:tab/>
-      </w:r>
-      <w:r>
         <w:t xml:space="preserve">6.7 Interface Specifications</w:t>
       </w:r>
     </w:p>
@@ -10684,15 +10324,6 @@
       <w:pPr>
         <w:pStyle w:val="Heading4"/>
       </w:pPr>
-      <w:r>
-        <w:rPr>
-          <w:rStyle w:val="SectionNumber"/>
-        </w:rPr>
-        <w:t xml:space="preserve">1.7.7.1</w:t>
-      </w:r>
-      <w:r>
-        <w:tab/>
-      </w:r>
       <w:r>
         <w:t xml:space="preserve">6.7.1 Fiber Optic Interfaces (via Interface Chassis)</w:t>
       </w:r>
@@ -11069,15 +10700,6 @@
         <w:pStyle w:val="Heading4"/>
       </w:pPr>
       <w:r>
-        <w:rPr>
-          <w:rStyle w:val="SectionNumber"/>
-        </w:rPr>
-        <w:t xml:space="preserve">1.7.7.2</w:t>
-      </w:r>
-      <w:r>
-        <w:tab/>
-      </w:r>
-      <w:r>
         <w:t xml:space="preserve">6.7.2 EPICS Interface (via CompactLogix PLC)</w:t>
       </w:r>
     </w:p>
@@ -11869,15 +11491,6 @@
         <w:pStyle w:val="Heading3"/>
       </w:pPr>
       <w:r>
-        <w:rPr>
-          <w:rStyle w:val="SectionNumber"/>
-        </w:rPr>
-        <w:t xml:space="preserve">1.7.8</w:t>
-      </w:r>
-      <w:r>
-        <w:tab/>
-      </w:r>
-      <w:r>
         <w:t xml:space="preserve">6.8 Control Algorithm Specifications</w:t>
       </w:r>
     </w:p>
@@ -11886,15 +11499,6 @@
       <w:pPr>
         <w:pStyle w:val="Heading4"/>
       </w:pPr>
-      <w:r>
-        <w:rPr>
-          <w:rStyle w:val="SectionNumber"/>
-        </w:rPr>
-        <w:t xml:space="preserve">1.7.8.1</w:t>
-      </w:r>
-      <w:r>
-        <w:tab/>
-      </w:r>
       <w:r>
         <w:t xml:space="preserve">6.8.1 Voltage Regulation Loop</w:t>
       </w:r>
@@ -12034,15 +11638,6 @@
       <w:pPr>
         <w:pStyle w:val="Heading4"/>
       </w:pPr>
-      <w:r>
-        <w:rPr>
-          <w:rStyle w:val="SectionNumber"/>
-        </w:rPr>
-        <w:t xml:space="preserve">1.7.8.2</w:t>
-      </w:r>
-      <w:r>
-        <w:tab/>
-      </w:r>
       <w:r>
         <w:t xml:space="preserve">6.8.2 Machine Protection System Integration</w:t>
       </w:r>
@@ -12172,15 +11767,6 @@
         <w:pStyle w:val="Heading3"/>
       </w:pPr>
       <w:r>
-        <w:rPr>
-          <w:rStyle w:val="SectionNumber"/>
-        </w:rPr>
-        <w:t xml:space="preserve">1.7.9</w:t>
-      </w:r>
-      <w:r>
-        <w:tab/>
-      </w:r>
-      <w:r>
         <w:t xml:space="preserve">6.9 Integration with Upgrade System</w:t>
       </w:r>
     </w:p>
@@ -12189,15 +11775,6 @@
       <w:pPr>
         <w:pStyle w:val="Heading4"/>
       </w:pPr>
-      <w:r>
-        <w:rPr>
-          <w:rStyle w:val="SectionNumber"/>
-        </w:rPr>
-        <w:t xml:space="preserve">1.7.9.1</w:t>
-      </w:r>
-      <w:r>
-        <w:tab/>
-      </w:r>
       <w:r>
         <w:t xml:space="preserve">6.9.1 HVPS-LLRF9 Coordination</w:t>
       </w:r>
@@ -12384,15 +11961,6 @@
       <w:pPr>
         <w:pStyle w:val="Heading4"/>
       </w:pPr>
-      <w:r>
-        <w:rPr>
-          <w:rStyle w:val="SectionNumber"/>
-        </w:rPr>
-        <w:t xml:space="preserve">1.7.9.2</w:t>
-      </w:r>
-      <w:r>
-        <w:tab/>
-      </w:r>
       <w:r>
         <w:t xml:space="preserve">6.9.2 Protection Coordination</w:t>
       </w:r>
@@ -12483,15 +12051,6 @@
         <w:pStyle w:val="Heading3"/>
       </w:pPr>
       <w:r>
-        <w:rPr>
-          <w:rStyle w:val="SectionNumber"/>
-        </w:rPr>
-        <w:t xml:space="preserve">1.7.10</w:t>
-      </w:r>
-      <w:r>
-        <w:tab/>
-      </w:r>
-      <w:r>
         <w:t xml:space="preserve">6.10 Implementation Plan</w:t>
       </w:r>
     </w:p>
@@ -12500,15 +12059,6 @@
       <w:pPr>
         <w:pStyle w:val="Heading4"/>
       </w:pPr>
-      <w:r>
-        <w:rPr>
-          <w:rStyle w:val="SectionNumber"/>
-        </w:rPr>
-        <w:t xml:space="preserve">1.7.10.1</w:t>
-      </w:r>
-      <w:r>
-        <w:tab/>
-      </w:r>
       <w:r>
         <w:t xml:space="preserve">6.10.1 Hardware Procurement</w:t>
       </w:r>
@@ -12663,15 +12213,6 @@
         <w:pStyle w:val="Heading4"/>
       </w:pPr>
       <w:r>
-        <w:rPr>
-          <w:rStyle w:val="SectionNumber"/>
-        </w:rPr>
-        <w:t xml:space="preserve">1.7.10.2</w:t>
-      </w:r>
-      <w:r>
-        <w:tab/>
-      </w:r>
-      <w:r>
         <w:t xml:space="preserve">6.10.2 Software Development</w:t>
       </w:r>
     </w:p>
@@ -12857,15 +12398,6 @@
       <w:pPr>
         <w:pStyle w:val="Heading4"/>
       </w:pPr>
-      <w:r>
-        <w:rPr>
-          <w:rStyle w:val="SectionNumber"/>
-        </w:rPr>
-        <w:t xml:space="preserve">1.7.10.3</w:t>
-      </w:r>
-      <w:r>
-        <w:tab/>
-      </w:r>
       <w:r>
         <w:t xml:space="preserve">6.10.3 Testing and Commissioning</w:t>
       </w:r>
@@ -13123,15 +12655,6 @@
         <w:pStyle w:val="Heading3"/>
       </w:pPr>
       <w:r>
-        <w:rPr>
-          <w:rStyle w:val="SectionNumber"/>
-        </w:rPr>
-        <w:t xml:space="preserve">1.7.11</w:t>
-      </w:r>
-      <w:r>
-        <w:tab/>
-      </w:r>
-      <w:r>
         <w:t xml:space="preserve">6.11 HVPS Maintenance Item</w:t>
       </w:r>
     </w:p>
@@ -13295,15 +12818,6 @@
         <w:pStyle w:val="Heading2"/>
       </w:pPr>
       <w:r>
-        <w:rPr>
-          <w:rStyle w:val="SectionNumber"/>
-        </w:rPr>
-        <w:t xml:space="preserve">1.8</w:t>
-      </w:r>
-      <w:r>
-        <w:tab/>
-      </w:r>
-      <w:r>
         <w:t xml:space="preserve">7. Machine Protection System (MPS)</w:t>
       </w:r>
     </w:p>
@@ -13312,15 +12826,6 @@
       <w:pPr>
         <w:pStyle w:val="Heading3"/>
       </w:pPr>
-      <w:r>
-        <w:rPr>
-          <w:rStyle w:val="SectionNumber"/>
-        </w:rPr>
-        <w:t xml:space="preserve">1.8.1</w:t>
-      </w:r>
-      <w:r>
-        <w:tab/>
-      </w:r>
       <w:r>
         <w:t xml:space="preserve">7.1 Architecture</w:t>
       </w:r>
@@ -13370,15 +12875,6 @@
       <w:pPr>
         <w:pStyle w:val="Heading3"/>
       </w:pPr>
-      <w:r>
-        <w:rPr>
-          <w:rStyle w:val="SectionNumber"/>
-        </w:rPr>
-        <w:t xml:space="preserve">1.8.2</w:t>
-      </w:r>
-      <w:r>
-        <w:tab/>
-      </w:r>
       <w:r>
         <w:t xml:space="preserve">7.2 MPS Inputs (via Interface Chassis)</w:t>
       </w:r>
@@ -13709,15 +13205,6 @@
         <w:pStyle w:val="Heading3"/>
       </w:pPr>
       <w:r>
-        <w:rPr>
-          <w:rStyle w:val="SectionNumber"/>
-        </w:rPr>
-        <w:t xml:space="preserve">1.8.3</w:t>
-      </w:r>
-      <w:r>
-        <w:tab/>
-      </w:r>
-      <w:r>
         <w:t xml:space="preserve">7.3 MPS Outputs (via Interface Chassis)</w:t>
       </w:r>
     </w:p>
@@ -13895,15 +13382,6 @@
         <w:pStyle w:val="Heading3"/>
       </w:pPr>
       <w:r>
-        <w:rPr>
-          <w:rStyle w:val="SectionNumber"/>
-        </w:rPr>
-        <w:t xml:space="preserve">1.8.4</w:t>
-      </w:r>
-      <w:r>
-        <w:tab/>
-      </w:r>
-      <w:r>
         <w:t xml:space="preserve">7.4 MPS Role</w:t>
       </w:r>
     </w:p>
@@ -13982,15 +13460,6 @@
         <w:pStyle w:val="Heading2"/>
       </w:pPr>
       <w:r>
-        <w:rPr>
-          <w:rStyle w:val="SectionNumber"/>
-        </w:rPr>
-        <w:t xml:space="preserve">1.9</w:t>
-      </w:r>
-      <w:r>
-        <w:tab/>
-      </w:r>
-      <w:r>
         <w:t xml:space="preserve">8. Tuner Motor Control System</w:t>
       </w:r>
     </w:p>
@@ -13999,15 +13468,6 @@
       <w:pPr>
         <w:pStyle w:val="Heading3"/>
       </w:pPr>
-      <w:r>
-        <w:rPr>
-          <w:rStyle w:val="SectionNumber"/>
-        </w:rPr>
-        <w:t xml:space="preserve">1.9.1</w:t>
-      </w:r>
-      <w:r>
-        <w:tab/>
-      </w:r>
       <w:r>
         <w:t xml:space="preserve">8.1 Physical System (Retained)</w:t>
       </w:r>
@@ -14122,15 +13582,6 @@
         <w:pStyle w:val="Heading3"/>
       </w:pPr>
       <w:r>
-        <w:rPr>
-          <w:rStyle w:val="SectionNumber"/>
-        </w:rPr>
-        <w:t xml:space="preserve">1.9.2</w:t>
-      </w:r>
-      <w:r>
-        <w:tab/>
-      </w:r>
-      <w:r>
         <w:t xml:space="preserve">8.2 Legacy Controller (Being Replaced)</w:t>
       </w:r>
     </w:p>
@@ -14188,15 +13639,6 @@
       <w:pPr>
         <w:pStyle w:val="Heading3"/>
       </w:pPr>
-      <w:r>
-        <w:rPr>
-          <w:rStyle w:val="SectionNumber"/>
-        </w:rPr>
-        <w:t xml:space="preserve">1.9.3</w:t>
-      </w:r>
-      <w:r>
-        <w:tab/>
-      </w:r>
       <w:r>
         <w:t xml:space="preserve">8.3 Candidate Replacement Controllers</w:t>
       </w:r>
@@ -14484,15 +13926,6 @@
         <w:pStyle w:val="Heading3"/>
       </w:pPr>
       <w:r>
-        <w:rPr>
-          <w:rStyle w:val="SectionNumber"/>
-        </w:rPr>
-        <w:t xml:space="preserve">1.9.4</w:t>
-      </w:r>
-      <w:r>
-        <w:tab/>
-      </w:r>
-      <w:r>
         <w:t xml:space="preserve">8.4 Requirements</w:t>
       </w:r>
     </w:p>
@@ -14713,15 +14146,6 @@
         <w:pStyle w:val="Heading3"/>
       </w:pPr>
       <w:r>
-        <w:rPr>
-          <w:rStyle w:val="SectionNumber"/>
-        </w:rPr>
-        <w:t xml:space="preserve">1.9.5</w:t>
-      </w:r>
-      <w:r>
-        <w:tab/>
-      </w:r>
-      <w:r>
         <w:t xml:space="preserve">8.5 Resolution Calculations</w:t>
       </w:r>
     </w:p>
@@ -14813,15 +14237,6 @@
       <w:pPr>
         <w:pStyle w:val="Heading3"/>
       </w:pPr>
-      <w:r>
-        <w:rPr>
-          <w:rStyle w:val="SectionNumber"/>
-        </w:rPr>
-        <w:t xml:space="preserve">1.9.6</w:t>
-      </w:r>
-      <w:r>
-        <w:tab/>
-      </w:r>
       <w:r>
         <w:t xml:space="preserve">8.6 Typical Motion Parameters</w:t>
       </w:r>
@@ -14917,15 +14332,6 @@
         <w:pStyle w:val="Heading2"/>
       </w:pPr>
       <w:r>
-        <w:rPr>
-          <w:rStyle w:val="SectionNumber"/>
-        </w:rPr>
-        <w:t xml:space="preserve">1.10</w:t>
-      </w:r>
-      <w:r>
-        <w:tab/>
-      </w:r>
-      <w:r>
         <w:t xml:space="preserve">9. Arc Detection System</w:t>
       </w:r>
     </w:p>
@@ -14934,15 +14340,6 @@
       <w:pPr>
         <w:pStyle w:val="Heading3"/>
       </w:pPr>
-      <w:r>
-        <w:rPr>
-          <w:rStyle w:val="SectionNumber"/>
-        </w:rPr>
-        <w:t xml:space="preserve">1.10.1</w:t>
-      </w:r>
-      <w:r>
-        <w:tab/>
-      </w:r>
       <w:r>
         <w:t xml:space="preserve">9.1 Overview</w:t>
       </w:r>
@@ -14961,15 +14358,6 @@
       <w:pPr>
         <w:pStyle w:val="Heading3"/>
       </w:pPr>
-      <w:r>
-        <w:rPr>
-          <w:rStyle w:val="SectionNumber"/>
-        </w:rPr>
-        <w:t xml:space="preserve">1.10.2</w:t>
-      </w:r>
-      <w:r>
-        <w:tab/>
-      </w:r>
       <w:r>
         <w:t xml:space="preserve">9.2 Sensor Placement</w:t>
       </w:r>
@@ -15017,15 +14405,6 @@
         <w:pStyle w:val="Heading3"/>
       </w:pPr>
       <w:r>
-        <w:rPr>
-          <w:rStyle w:val="SectionNumber"/>
-        </w:rPr>
-        <w:t xml:space="preserve">1.10.3</w:t>
-      </w:r>
-      <w:r>
-        <w:tab/>
-      </w:r>
-      <w:r>
         <w:t xml:space="preserve">9.3 Signal Path</w:t>
       </w:r>
     </w:p>
@@ -15043,15 +14422,6 @@
       <w:pPr>
         <w:pStyle w:val="Heading3"/>
       </w:pPr>
-      <w:r>
-        <w:rPr>
-          <w:rStyle w:val="SectionNumber"/>
-        </w:rPr>
-        <w:t xml:space="preserve">1.10.4</w:t>
-      </w:r>
-      <w:r>
-        <w:tab/>
-      </w:r>
       <w:r>
         <w:t xml:space="preserve">9.4 Cost Estimate</w:t>
       </w:r>
@@ -15275,15 +14645,6 @@
         <w:pStyle w:val="Heading2"/>
       </w:pPr>
       <w:r>
-        <w:rPr>
-          <w:rStyle w:val="SectionNumber"/>
-        </w:rPr>
-        <w:t xml:space="preserve">1.11</w:t>
-      </w:r>
-      <w:r>
-        <w:tab/>
-      </w:r>
-      <w:r>
         <w:t xml:space="preserve">10. Station State Machine</w:t>
       </w:r>
     </w:p>
@@ -15292,15 +14653,6 @@
       <w:pPr>
         <w:pStyle w:val="Heading3"/>
       </w:pPr>
-      <w:r>
-        <w:rPr>
-          <w:rStyle w:val="SectionNumber"/>
-        </w:rPr>
-        <w:t xml:space="preserve">1.11.1</w:t>
-      </w:r>
-      <w:r>
-        <w:tab/>
-      </w:r>
       <w:r>
         <w:t xml:space="preserve">10.1 Active States</w:t>
       </w:r>
@@ -15674,15 +15026,6 @@
         <w:pStyle w:val="Heading3"/>
       </w:pPr>
       <w:r>
-        <w:rPr>
-          <w:rStyle w:val="SectionNumber"/>
-        </w:rPr>
-        <w:t xml:space="preserve">1.11.2</w:t>
-      </w:r>
-      <w:r>
-        <w:tab/>
-      </w:r>
-      <w:r>
         <w:t xml:space="preserve">10.2 State Transitions</w:t>
       </w:r>
     </w:p>
@@ -15896,15 +15239,6 @@
         <w:pStyle w:val="Heading3"/>
       </w:pPr>
       <w:r>
-        <w:rPr>
-          <w:rStyle w:val="SectionNumber"/>
-        </w:rPr>
-        <w:t xml:space="preserve">1.11.3</w:t>
-      </w:r>
-      <w:r>
-        <w:tab/>
-      </w:r>
-      <w:r>
         <w:t xml:space="preserve">10.3 Turn-On Sequence (OFF -&gt; TUNE -&gt; ON_CW)</w:t>
       </w:r>
     </w:p>
@@ -16118,15 +15452,6 @@
       <w:pPr>
         <w:pStyle w:val="Heading3"/>
       </w:pPr>
-      <w:r>
-        <w:rPr>
-          <w:rStyle w:val="SectionNumber"/>
-        </w:rPr>
-        <w:t xml:space="preserve">1.11.4</w:t>
-      </w:r>
-      <w:r>
-        <w:tab/>
-      </w:r>
       <w:r>
         <w:t xml:space="preserve">10.4 Shutdown Sequence (ON_CW -&gt; OFF)</w:t>
       </w:r>
@@ -16222,15 +15547,6 @@
         <w:pStyle w:val="Heading3"/>
       </w:pPr>
       <w:r>
-        <w:rPr>
-          <w:rStyle w:val="SectionNumber"/>
-        </w:rPr>
-        <w:t xml:space="preserve">1.11.5</w:t>
-      </w:r>
-      <w:r>
-        <w:tab/>
-      </w:r>
-      <w:r>
         <w:t xml:space="preserve">10.5 Fault-Driven Transitions (Any -&gt; OFF)</w:t>
       </w:r>
     </w:p>
@@ -16278,15 +15594,6 @@
       <w:pPr>
         <w:pStyle w:val="Heading3"/>
       </w:pPr>
-      <w:r>
-        <w:rPr>
-          <w:rStyle w:val="SectionNumber"/>
-        </w:rPr>
-        <w:t xml:space="preserve">1.11.6</w:t>
-      </w:r>
-      <w:r>
-        <w:tab/>
-      </w:r>
       <w:r>
         <w:t xml:space="preserve">10.6 Interlock Requirements per State</w:t>
       </w:r>
@@ -16663,15 +15970,6 @@
         <w:pStyle w:val="Heading2"/>
       </w:pPr>
       <w:r>
-        <w:rPr>
-          <w:rStyle w:val="SectionNumber"/>
-        </w:rPr>
-        <w:t xml:space="preserve">1.12</w:t>
-      </w:r>
-      <w:r>
-        <w:tab/>
-      </w:r>
-      <w:r>
         <w:t xml:space="preserve">11. HVPS Supervisory Control Loop</w:t>
       </w:r>
     </w:p>
@@ -16680,15 +15978,6 @@
       <w:pPr>
         <w:pStyle w:val="Heading3"/>
       </w:pPr>
-      <w:r>
-        <w:rPr>
-          <w:rStyle w:val="SectionNumber"/>
-        </w:rPr>
-        <w:t xml:space="preserve">1.12.1</w:t>
-      </w:r>
-      <w:r>
-        <w:tab/>
-      </w:r>
       <w:r>
         <w:t xml:space="preserve">11.1 Purpose</w:t>
       </w:r>
@@ -16708,15 +15997,6 @@
         <w:pStyle w:val="Heading3"/>
       </w:pPr>
       <w:r>
-        <w:rPr>
-          <w:rStyle w:val="SectionNumber"/>
-        </w:rPr>
-        <w:t xml:space="preserve">1.12.2</w:t>
-      </w:r>
-      <w:r>
-        <w:tab/>
-      </w:r>
-      <w:r>
         <w:t xml:space="preserve">11.2 Operating Modes</w:t>
       </w:r>
     </w:p>
@@ -16895,15 +16175,6 @@
         <w:pStyle w:val="Heading3"/>
       </w:pPr>
       <w:r>
-        <w:rPr>
-          <w:rStyle w:val="SectionNumber"/>
-        </w:rPr>
-        <w:t xml:space="preserve">1.12.3</w:t>
-      </w:r>
-      <w:r>
-        <w:tab/>
-      </w:r>
-      <w:r>
         <w:t xml:space="preserve">11.3 Control Algorithm</w:t>
       </w:r>
     </w:p>
@@ -17032,15 +16303,6 @@
       <w:pPr>
         <w:pStyle w:val="Heading3"/>
       </w:pPr>
-      <w:r>
-        <w:rPr>
-          <w:rStyle w:val="SectionNumber"/>
-        </w:rPr>
-        <w:t xml:space="preserve">1.12.4</w:t>
-      </w:r>
-      <w:r>
-        <w:tab/>
-      </w:r>
       <w:r>
         <w:t xml:space="preserve">11.4 Key Parameters</w:t>
       </w:r>
@@ -17418,15 +16680,6 @@
         <w:pStyle w:val="Heading3"/>
       </w:pPr>
       <w:r>
-        <w:rPr>
-          <w:rStyle w:val="SectionNumber"/>
-        </w:rPr>
-        <w:t xml:space="preserve">1.12.5</w:t>
-      </w:r>
-      <w:r>
-        <w:tab/>
-      </w:r>
-      <w:r>
         <w:t xml:space="preserve">11.5 Safety Considerations</w:t>
       </w:r>
     </w:p>
@@ -17539,15 +16792,6 @@
         <w:pStyle w:val="Heading2"/>
       </w:pPr>
       <w:r>
-        <w:rPr>
-          <w:rStyle w:val="SectionNumber"/>
-        </w:rPr>
-        <w:t xml:space="preserve">1.13</w:t>
-      </w:r>
-      <w:r>
-        <w:tab/>
-      </w:r>
-      <w:r>
         <w:t xml:space="preserve">12. Tuner Supervisory Control</w:t>
       </w:r>
     </w:p>
@@ -17556,15 +16800,6 @@
       <w:pPr>
         <w:pStyle w:val="Heading3"/>
       </w:pPr>
-      <w:r>
-        <w:rPr>
-          <w:rStyle w:val="SectionNumber"/>
-        </w:rPr>
-        <w:t xml:space="preserve">1.13.1</w:t>
-      </w:r>
-      <w:r>
-        <w:tab/>
-      </w:r>
       <w:r>
         <w:t xml:space="preserve">12.1 Architecture</w:t>
       </w:r>
@@ -17641,15 +16876,6 @@
         <w:pStyle w:val="Heading3"/>
       </w:pPr>
       <w:r>
-        <w:rPr>
-          <w:rStyle w:val="SectionNumber"/>
-        </w:rPr>
-        <w:t xml:space="preserve">1.13.2</w:t>
-      </w:r>
-      <w:r>
-        <w:tab/>
-      </w:r>
-      <w:r>
         <w:t xml:space="preserve">12.2 Phase-Based Tuning Algorithm</w:t>
       </w:r>
     </w:p>
@@ -17761,15 +16987,6 @@
         <w:pStyle w:val="Heading3"/>
       </w:pPr>
       <w:r>
-        <w:rPr>
-          <w:rStyle w:val="SectionNumber"/>
-        </w:rPr>
-        <w:t xml:space="preserve">1.13.3</w:t>
-      </w:r>
-      <w:r>
-        <w:tab/>
-      </w:r>
-      <w:r>
         <w:t xml:space="preserve">12.3 Load Angle Offset Loop</w:t>
       </w:r>
     </w:p>
@@ -17897,15 +17114,6 @@
         <w:pStyle w:val="Heading3"/>
       </w:pPr>
       <w:r>
-        <w:rPr>
-          <w:rStyle w:val="SectionNumber"/>
-        </w:rPr>
-        <w:t xml:space="preserve">1.13.4</w:t>
-      </w:r>
-      <w:r>
-        <w:tab/>
-      </w:r>
-      <w:r>
         <w:t xml:space="preserve">12.4 Home Position Management</w:t>
       </w:r>
     </w:p>
@@ -18054,15 +17262,6 @@
       <w:pPr>
         <w:pStyle w:val="Heading3"/>
       </w:pPr>
-      <w:r>
-        <w:rPr>
-          <w:rStyle w:val="SectionNumber"/>
-        </w:rPr>
-        <w:t xml:space="preserve">1.13.5</w:t>
-      </w:r>
-      <w:r>
-        <w:tab/>
-      </w:r>
       <w:r>
         <w:t xml:space="preserve">12.5 Safety Interlocks for Tuners</w:t>
       </w:r>
@@ -18194,15 +17393,6 @@
         <w:pStyle w:val="Heading2"/>
       </w:pPr>
       <w:r>
-        <w:rPr>
-          <w:rStyle w:val="SectionNumber"/>
-        </w:rPr>
-        <w:t xml:space="preserve">1.14</w:t>
-      </w:r>
-      <w:r>
-        <w:tab/>
-      </w:r>
-      <w:r>
         <w:t xml:space="preserve">13. Software Architecture</w:t>
       </w:r>
     </w:p>
@@ -18211,15 +17401,6 @@
       <w:pPr>
         <w:pStyle w:val="Heading3"/>
       </w:pPr>
-      <w:r>
-        <w:rPr>
-          <w:rStyle w:val="SectionNumber"/>
-        </w:rPr>
-        <w:t xml:space="preserve">1.14.1</w:t>
-      </w:r>
-      <w:r>
-        <w:tab/>
-      </w:r>
       <w:r>
         <w:t xml:space="preserve">13.1 Technology Stack</w:t>
       </w:r>
@@ -18598,15 +17779,6 @@
         <w:pStyle w:val="Heading3"/>
       </w:pPr>
       <w:r>
-        <w:rPr>
-          <w:rStyle w:val="SectionNumber"/>
-        </w:rPr>
-        <w:t xml:space="preserve">1.14.2</w:t>
-      </w:r>
-      <w:r>
-        <w:tab/>
-      </w:r>
-      <w:r>
         <w:t xml:space="preserve">13.2 Module Architecture</w:t>
       </w:r>
     </w:p>
@@ -19006,15 +18178,6 @@
         <w:pStyle w:val="Heading3"/>
       </w:pPr>
       <w:r>
-        <w:rPr>
-          <w:rStyle w:val="SectionNumber"/>
-        </w:rPr>
-        <w:t xml:space="preserve">1.14.3</w:t>
-      </w:r>
-      <w:r>
-        <w:tab/>
-      </w:r>
-      <w:r>
         <w:t xml:space="preserve">13.3 Core Design Patterns</w:t>
       </w:r>
     </w:p>
@@ -20448,15 +19611,6 @@
       <w:pPr>
         <w:pStyle w:val="Heading3"/>
       </w:pPr>
-      <w:r>
-        <w:rPr>
-          <w:rStyle w:val="SectionNumber"/>
-        </w:rPr>
-        <w:t xml:space="preserve">1.14.4</w:t>
-      </w:r>
-      <w:r>
-        <w:tab/>
-      </w:r>
       <w:r>
         <w:t xml:space="preserve">13.4 Main Control Loop</w:t>
       </w:r>
@@ -21189,15 +20343,6 @@
         <w:pStyle w:val="Heading2"/>
       </w:pPr>
       <w:r>
-        <w:rPr>
-          <w:rStyle w:val="SectionNumber"/>
-        </w:rPr>
-        <w:t xml:space="preserve">1.15</w:t>
-      </w:r>
-      <w:r>
-        <w:tab/>
-      </w:r>
-      <w:r>
         <w:t xml:space="preserve">14. Fault Management &amp; Diagnostics</w:t>
       </w:r>
     </w:p>
@@ -21206,15 +20351,6 @@
       <w:pPr>
         <w:pStyle w:val="Heading3"/>
       </w:pPr>
-      <w:r>
-        <w:rPr>
-          <w:rStyle w:val="SectionNumber"/>
-        </w:rPr>
-        <w:t xml:space="preserve">1.15.1</w:t>
-      </w:r>
-      <w:r>
-        <w:tab/>
-      </w:r>
       <w:r>
         <w:t xml:space="preserve">14.1 Fault Detection Sources</w:t>
       </w:r>
@@ -21545,15 +20681,6 @@
         <w:pStyle w:val="Heading3"/>
       </w:pPr>
       <w:r>
-        <w:rPr>
-          <w:rStyle w:val="SectionNumber"/>
-        </w:rPr>
-        <w:t xml:space="preserve">1.15.2</w:t>
-      </w:r>
-      <w:r>
-        <w:tab/>
-      </w:r>
-      <w:r>
         <w:t xml:space="preserve">14.2 Fault Data Capture</w:t>
       </w:r>
     </w:p>
@@ -21665,15 +20792,6 @@
         <w:pStyle w:val="Heading3"/>
       </w:pPr>
       <w:r>
-        <w:rPr>
-          <w:rStyle w:val="SectionNumber"/>
-        </w:rPr>
-        <w:t xml:space="preserve">1.15.3</w:t>
-      </w:r>
-      <w:r>
-        <w:tab/>
-      </w:r>
-      <w:r>
         <w:t xml:space="preserve">14.3 Auto-Reset Logic</w:t>
       </w:r>
     </w:p>
@@ -21830,15 +20948,6 @@
         <w:pStyle w:val="Heading3"/>
       </w:pPr>
       <w:r>
-        <w:rPr>
-          <w:rStyle w:val="SectionNumber"/>
-        </w:rPr>
-        <w:t xml:space="preserve">1.15.4</w:t>
-      </w:r>
-      <w:r>
-        <w:tab/>
-      </w:r>
-      <w:r>
         <w:t xml:space="preserve">14.4 First-Fault Analysis</w:t>
       </w:r>
     </w:p>
@@ -21939,15 +21048,6 @@
       <w:pPr>
         <w:pStyle w:val="Heading3"/>
       </w:pPr>
-      <w:r>
-        <w:rPr>
-          <w:rStyle w:val="SectionNumber"/>
-        </w:rPr>
-        <w:t xml:space="preserve">1.15.5</w:t>
-      </w:r>
-      <w:r>
-        <w:tab/>
-      </w:r>
       <w:r>
         <w:t xml:space="preserve">14.5 Diagnostic Tools</w:t>
       </w:r>
@@ -22286,15 +21386,6 @@
         <w:pStyle w:val="Heading2"/>
       </w:pPr>
       <w:r>
-        <w:rPr>
-          <w:rStyle w:val="SectionNumber"/>
-        </w:rPr>
-        <w:t xml:space="preserve">1.16</w:t>
-      </w:r>
-      <w:r>
-        <w:tab/>
-      </w:r>
-      <w:r>
         <w:t xml:space="preserve">15. EPICS Process Variable Architecture</w:t>
       </w:r>
     </w:p>
@@ -22303,15 +21394,6 @@
       <w:pPr>
         <w:pStyle w:val="Heading3"/>
       </w:pPr>
-      <w:r>
-        <w:rPr>
-          <w:rStyle w:val="SectionNumber"/>
-        </w:rPr>
-        <w:t xml:space="preserve">1.16.1</w:t>
-      </w:r>
-      <w:r>
-        <w:tab/>
-      </w:r>
       <w:r>
         <w:t xml:space="preserve">15.1 PV Naming Convention</w:t>
       </w:r>
@@ -22600,15 +21682,6 @@
       <w:pPr>
         <w:pStyle w:val="Heading3"/>
       </w:pPr>
-      <w:r>
-        <w:rPr>
-          <w:rStyle w:val="SectionNumber"/>
-        </w:rPr>
-        <w:t xml:space="preserve">1.16.2</w:t>
-      </w:r>
-      <w:r>
-        <w:tab/>
-      </w:r>
       <w:r>
         <w:t xml:space="preserve">15.2 Key PV Groups</w:t>
       </w:r>
@@ -23869,15 +22942,6 @@
         <w:pStyle w:val="Heading2"/>
       </w:pPr>
       <w:r>
-        <w:rPr>
-          <w:rStyle w:val="SectionNumber"/>
-        </w:rPr>
-        <w:t xml:space="preserve">1.17</w:t>
-      </w:r>
-      <w:r>
-        <w:tab/>
-      </w:r>
-      <w:r>
         <w:t xml:space="preserve">16. Implementation Phases &amp; Commissioning</w:t>
       </w:r>
     </w:p>
@@ -23886,15 +22950,6 @@
       <w:pPr>
         <w:pStyle w:val="Heading3"/>
       </w:pPr>
-      <w:r>
-        <w:rPr>
-          <w:rStyle w:val="SectionNumber"/>
-        </w:rPr>
-        <w:t xml:space="preserve">1.17.1</w:t>
-      </w:r>
-      <w:r>
-        <w:tab/>
-      </w:r>
       <w:r>
         <w:t xml:space="preserve">16.1 Project Constraints</w:t>
       </w:r>
@@ -23975,15 +23030,6 @@
       <w:pPr>
         <w:pStyle w:val="Heading3"/>
       </w:pPr>
-      <w:r>
-        <w:rPr>
-          <w:rStyle w:val="SectionNumber"/>
-        </w:rPr>
-        <w:t xml:space="preserve">1.17.2</w:t>
-      </w:r>
-      <w:r>
-        <w:tab/>
-      </w:r>
       <w:r>
         <w:t xml:space="preserve">16.2 Current Project Status Summary</w:t>
       </w:r>
@@ -24342,15 +23388,6 @@
         <w:pStyle w:val="Heading3"/>
       </w:pPr>
       <w:r>
-        <w:rPr>
-          <w:rStyle w:val="SectionNumber"/>
-        </w:rPr>
-        <w:t xml:space="preserve">1.17.3</w:t>
-      </w:r>
-      <w:r>
-        <w:tab/>
-      </w:r>
-      <w:r>
         <w:t xml:space="preserve">16.3 Revised Implementation Strategy</w:t>
       </w:r>
     </w:p>
@@ -24801,15 +23838,6 @@
         <w:pStyle w:val="Heading3"/>
       </w:pPr>
       <w:r>
-        <w:rPr>
-          <w:rStyle w:val="SectionNumber"/>
-        </w:rPr>
-        <w:t xml:space="preserve">1.17.4</w:t>
-      </w:r>
-      <w:r>
-        <w:tab/>
-      </w:r>
-      <w:r>
         <w:t xml:space="preserve">16.4 Risk Mitigation Strategies</w:t>
       </w:r>
     </w:p>
@@ -24940,15 +23968,6 @@
         <w:pStyle w:val="Heading3"/>
       </w:pPr>
       <w:r>
-        <w:rPr>
-          <w:rStyle w:val="SectionNumber"/>
-        </w:rPr>
-        <w:t xml:space="preserve">1.17.5</w:t>
-      </w:r>
-      <w:r>
-        <w:tab/>
-      </w:r>
-      <w:r>
         <w:t xml:space="preserve">16.5 Dimtel Commissioning Support Window</w:t>
       </w:r>
     </w:p>
@@ -25093,15 +24112,6 @@
       <w:pPr>
         <w:pStyle w:val="Heading3"/>
       </w:pPr>
-      <w:r>
-        <w:rPr>
-          <w:rStyle w:val="SectionNumber"/>
-        </w:rPr>
-        <w:t xml:space="preserve">1.17.6</w:t>
-      </w:r>
-      <w:r>
-        <w:tab/>
-      </w:r>
       <w:r>
         <w:t xml:space="preserve">16.6 Success Criteria</w:t>
       </w:r>
@@ -25470,15 +24480,6 @@
         <w:pStyle w:val="Heading3"/>
       </w:pPr>
       <w:r>
-        <w:rPr>
-          <w:rStyle w:val="SectionNumber"/>
-        </w:rPr>
-        <w:t xml:space="preserve">1.17.7</w:t>
-      </w:r>
-      <w:r>
-        <w:tab/>
-      </w:r>
-      <w:r>
         <w:t xml:space="preserve">16.7 Critical Path Items</w:t>
       </w:r>
     </w:p>
@@ -25598,15 +24599,6 @@
         <w:pStyle w:val="Heading2"/>
       </w:pPr>
       <w:r>
-        <w:rPr>
-          <w:rStyle w:val="SectionNumber"/>
-        </w:rPr>
-        <w:t xml:space="preserve">1.18</w:t>
-      </w:r>
-      <w:r>
-        <w:tab/>
-      </w:r>
-      <w:r>
         <w:t xml:space="preserve">17. Open Engineering Decisions</w:t>
       </w:r>
     </w:p>
@@ -25623,15 +24615,6 @@
       <w:pPr>
         <w:pStyle w:val="Heading3"/>
       </w:pPr>
-      <w:r>
-        <w:rPr>
-          <w:rStyle w:val="SectionNumber"/>
-        </w:rPr>
-        <w:t xml:space="preserve">1.18.1</w:t>
-      </w:r>
-      <w:r>
-        <w:tab/>
-      </w:r>
       <w:r>
         <w:t xml:space="preserve">17.1 Hardware Decisions</w:t>
       </w:r>
@@ -25925,15 +24908,6 @@
         <w:pStyle w:val="Heading3"/>
       </w:pPr>
       <w:r>
-        <w:rPr>
-          <w:rStyle w:val="SectionNumber"/>
-        </w:rPr>
-        <w:t xml:space="preserve">1.18.2</w:t>
-      </w:r>
-      <w:r>
-        <w:tab/>
-      </w:r>
-      <w:r>
         <w:t xml:space="preserve">17.2 Software/Communication Decisions</w:t>
       </w:r>
     </w:p>
@@ -26226,15 +25200,6 @@
         <w:pStyle w:val="Heading3"/>
       </w:pPr>
       <w:r>
-        <w:rPr>
-          <w:rStyle w:val="SectionNumber"/>
-        </w:rPr>
-        <w:t xml:space="preserve">1.18.3</w:t>
-      </w:r>
-      <w:r>
-        <w:tab/>
-      </w:r>
-      <w:r>
         <w:t xml:space="preserve">17.3 Operational Decisions</w:t>
       </w:r>
     </w:p>
@@ -26527,15 +25492,6 @@
         <w:pStyle w:val="Heading3"/>
       </w:pPr>
       <w:r>
-        <w:rPr>
-          <w:rStyle w:val="SectionNumber"/>
-        </w:rPr>
-        <w:t xml:space="preserve">1.18.4</w:t>
-      </w:r>
-      <w:r>
-        <w:tab/>
-      </w:r>
-      <w:r>
         <w:t xml:space="preserve">17.4 Procurement</w:t>
       </w:r>
     </w:p>
@@ -26956,15 +25912,6 @@
       <w:pPr>
         <w:pStyle w:val="Heading2"/>
       </w:pPr>
-      <w:r>
-        <w:rPr>
-          <w:rStyle w:val="SectionNumber"/>
-        </w:rPr>
-        <w:t xml:space="preserve">1.19</w:t>
-      </w:r>
-      <w:r>
-        <w:tab/>
-      </w:r>
       <w:r>
         <w:t xml:space="preserve">Appendix A: Legacy-to-Upgrade Function Mapping</w:t>
       </w:r>
@@ -27946,15 +26893,6 @@
       <w:pPr>
         <w:pStyle w:val="Heading2"/>
       </w:pPr>
-      <w:r>
-        <w:rPr>
-          <w:rStyle w:val="SectionNumber"/>
-        </w:rPr>
-        <w:t xml:space="preserve">1.20</w:t>
-      </w:r>
-      <w:r>
-        <w:tab/>
-      </w:r>
       <w:r>
         <w:t xml:space="preserve">Appendix B: Source Material References</w:t>
       </w:r>

</xml_diff>